<commit_message>
CIS 2026-27: apply GAIL 07.07.2026 feedback - drop 2 tables
Per GAIL's 07.07.2026 reply (screenshot of YRVA_QAIS_DATA):
- Customer type now read from the EXISTING field YRVA_QAIS_DATA-YY_CUSCLASS
  ('TRADER' => T / AUT-Trader, else A / Actual User) in get_cust_wv_floor.
  Drop table YCIS_CUST_TYPE and the KNA1-KATR2 lookup.
- 200 MT upper cap is already handled in YRVG004 at CIS creation, so drop
  table YCIS_SCH_PARAM and the unused lv_trader_cap_mt staging.

Package now has 3 tables (YCIS_WAIVER_RULE, YCIS_SHORTFALL, YCIS_NODISC_GRD),
5 domains + 5 data elements, and both programs. Regenerate the abapGit ZIP,
the approval docx and the maintenance-note docx, and sync DDIC/copy/import
docs accordingly.

Co-Authored-By: Claude Opus 4.8 <noreply@anthropic.com>
Claude-Session: https://claude.ai/code/session_01A3BJ7ydDq6e8VDbD1uvXUk
</commit_message>
<xml_diff>
--- a/CIS_2026_27_Table_Maintenance_Note.docx
+++ b/CIS_2026_27_Table_Maintenance_Note.docx
@@ -451,7 +451,7 @@
                 <w:b w:val="0"/>
                 <w:sz w:val="19"/>
               </w:rPr>
-              <w:t>YCIS_CUST_TYPE</w:t>
+              <w:t>YCIS_WAIVER_RULE</w:t>
             </w:r>
           </w:p>
         </w:tc>
@@ -466,7 +466,7 @@
                 <w:b w:val="0"/>
                 <w:sz w:val="19"/>
               </w:rPr>
-              <w:t>Maps each customer attribute (KNA1-KATR2) to Actual User (A) or Trader/AUT (T)</w:t>
+              <w:t>Waiver rules: min-lifting %, no. of waivers, max per quarter, by customer type &amp; signing month</w:t>
             </w:r>
           </w:p>
         </w:tc>
@@ -481,7 +481,7 @@
                 <w:b w:val="0"/>
                 <w:sz w:val="19"/>
               </w:rPr>
-              <w:t>Master-data / CIS team</w:t>
+              <w:t>CIS process owner</w:t>
             </w:r>
           </w:p>
         </w:tc>
@@ -496,7 +496,7 @@
                 <w:b w:val="0"/>
                 <w:sz w:val="19"/>
               </w:rPr>
-              <w:t>Rarely — when a new attribute value is introduced</w:t>
+              <w:t>Once per scheme year (or on rule change)</w:t>
             </w:r>
           </w:p>
         </w:tc>
@@ -530,7 +530,7 @@
                 <w:b w:val="0"/>
                 <w:sz w:val="19"/>
               </w:rPr>
-              <w:t>YCIS_WAIVER_RULE</w:t>
+              <w:t>YCIS_SHORTFALL</w:t>
             </w:r>
           </w:p>
         </w:tc>
@@ -546,7 +546,7 @@
                 <w:b w:val="0"/>
                 <w:sz w:val="19"/>
               </w:rPr>
-              <w:t>Waiver rules: min-lifting %, no. of waivers, max per quarter, by customer type &amp; signing month</w:t>
+              <w:t>Materials declared shortfall for a given period (drives automatic monthly waiver)</w:t>
             </w:r>
           </w:p>
         </w:tc>
@@ -562,7 +562,7 @@
                 <w:b w:val="0"/>
                 <w:sz w:val="19"/>
               </w:rPr>
-              <w:t>CIS process owner</w:t>
+              <w:t>CIS process owner (PMG)</w:t>
             </w:r>
           </w:p>
         </w:tc>
@@ -578,7 +578,7 @@
                 <w:b w:val="0"/>
                 <w:sz w:val="19"/>
               </w:rPr>
-              <w:t>Once per scheme year (or on rule change)</w:t>
+              <w:t>Monthly / as declared</w:t>
             </w:r>
           </w:p>
         </w:tc>
@@ -610,7 +610,7 @@
                 <w:b w:val="0"/>
                 <w:sz w:val="19"/>
               </w:rPr>
-              <w:t>YCIS_SHORTFALL</w:t>
+              <w:t>YCIS_NODISC_GRD</w:t>
             </w:r>
           </w:p>
         </w:tc>
@@ -625,166 +625,7 @@
                 <w:b w:val="0"/>
                 <w:sz w:val="19"/>
               </w:rPr>
-              <w:t>Materials declared shortfall for a given period (drives automatic monthly waiver)</w:t>
-            </w:r>
-          </w:p>
-        </w:tc>
-        <w:tc>
-          <w:tcPr>
-            <w:tcW w:type="dxa" w:w="1656"/>
-          </w:tcPr>
-          <w:p>
-            <w:r/>
-            <w:r>
-              <w:rPr>
-                <w:b w:val="0"/>
-                <w:sz w:val="19"/>
-              </w:rPr>
-              <w:t>CIS process owner (PMG)</w:t>
-            </w:r>
-          </w:p>
-        </w:tc>
-        <w:tc>
-          <w:tcPr>
-            <w:tcW w:type="dxa" w:w="2160"/>
-          </w:tcPr>
-          <w:p>
-            <w:r/>
-            <w:r>
-              <w:rPr>
-                <w:b w:val="0"/>
-                <w:sz w:val="19"/>
-              </w:rPr>
-              <w:t>Monthly / as declared</w:t>
-            </w:r>
-          </w:p>
-        </w:tc>
-      </w:tr>
-      <w:tr>
-        <w:tc>
-          <w:tcPr>
-            <w:tcW w:type="dxa" w:w="432"/>
-            <w:shd w:val="clear" w:fill="F2F5FA"/>
-          </w:tcPr>
-          <w:p>
-            <w:r/>
-            <w:r>
-              <w:rPr>
-                <w:b w:val="0"/>
-                <w:sz w:val="19"/>
-              </w:rPr>
-              <w:t>4</w:t>
-            </w:r>
-          </w:p>
-        </w:tc>
-        <w:tc>
-          <w:tcPr>
-            <w:tcW w:type="dxa" w:w="2232"/>
-            <w:shd w:val="clear" w:fill="F2F5FA"/>
-          </w:tcPr>
-          <w:p>
-            <w:r/>
-            <w:r>
-              <w:rPr>
-                <w:b w:val="0"/>
-                <w:sz w:val="19"/>
-              </w:rPr>
-              <w:t>YCIS_NODISC_GRD</w:t>
-            </w:r>
-          </w:p>
-        </w:tc>
-        <w:tc>
-          <w:tcPr>
-            <w:tcW w:type="dxa" w:w="3600"/>
-            <w:shd w:val="clear" w:fill="F2F5FA"/>
-          </w:tcPr>
-          <w:p>
-            <w:r/>
-            <w:r>
-              <w:rPr>
-                <w:b w:val="0"/>
-                <w:sz w:val="19"/>
-              </w:rPr>
               <w:t>Grades that count for eligibility but receive no discount (PS/GS/Powder/Polyfines)</w:t>
-            </w:r>
-          </w:p>
-        </w:tc>
-        <w:tc>
-          <w:tcPr>
-            <w:tcW w:type="dxa" w:w="1656"/>
-            <w:shd w:val="clear" w:fill="F2F5FA"/>
-          </w:tcPr>
-          <w:p>
-            <w:r/>
-            <w:r>
-              <w:rPr>
-                <w:b w:val="0"/>
-                <w:sz w:val="19"/>
-              </w:rPr>
-              <w:t>CIS process owner</w:t>
-            </w:r>
-          </w:p>
-        </w:tc>
-        <w:tc>
-          <w:tcPr>
-            <w:tcW w:type="dxa" w:w="2160"/>
-            <w:shd w:val="clear" w:fill="F2F5FA"/>
-          </w:tcPr>
-          <w:p>
-            <w:r/>
-            <w:r>
-              <w:rPr>
-                <w:b w:val="0"/>
-                <w:sz w:val="19"/>
-              </w:rPr>
-              <w:t>Rarely — on grade-list change</w:t>
-            </w:r>
-          </w:p>
-        </w:tc>
-      </w:tr>
-      <w:tr>
-        <w:tc>
-          <w:tcPr>
-            <w:tcW w:type="dxa" w:w="432"/>
-          </w:tcPr>
-          <w:p>
-            <w:r/>
-            <w:r>
-              <w:rPr>
-                <w:b w:val="0"/>
-                <w:sz w:val="19"/>
-              </w:rPr>
-              <w:t>5</w:t>
-            </w:r>
-          </w:p>
-        </w:tc>
-        <w:tc>
-          <w:tcPr>
-            <w:tcW w:type="dxa" w:w="2232"/>
-          </w:tcPr>
-          <w:p>
-            <w:r/>
-            <w:r>
-              <w:rPr>
-                <w:b w:val="0"/>
-                <w:sz w:val="19"/>
-              </w:rPr>
-              <w:t>YCIS_SCH_PARAM</w:t>
-            </w:r>
-          </w:p>
-        </w:tc>
-        <w:tc>
-          <w:tcPr>
-            <w:tcW w:type="dxa" w:w="3600"/>
-          </w:tcPr>
-          <w:p>
-            <w:r/>
-            <w:r>
-              <w:rPr>
-                <w:b w:val="0"/>
-                <w:sz w:val="19"/>
-              </w:rPr>
-              <w:t>Numeric scheme parameters, e.g. Trader monthly cap = 200 MT</w:t>
             </w:r>
           </w:p>
         </w:tc>
@@ -814,12 +655,21 @@
                 <w:b w:val="0"/>
                 <w:sz w:val="19"/>
               </w:rPr>
-              <w:t>Rarely — on scheme change</w:t>
+              <w:t>Rarely — on grade-list change</w:t>
             </w:r>
           </w:p>
         </w:tc>
       </w:tr>
     </w:tbl>
+    <w:p>
+      <w:r>
+        <w:rPr>
+          <w:i/>
+          <w:sz w:val="19"/>
+        </w:rPr>
+        <w:t>Note: customer classification (Actual User / Trader) is taken from the existing field YRVA_QAIS_DATA-YY_CUSCLASS, and the 200 MT cap is already handled within YRVG004 at CIS creation — so no separate customer-type or scheme-parameter table is required (confirmed 07.07.2026).</w:t>
+      </w:r>
+    </w:p>
     <w:p>
       <w:r>
         <w:rPr>
@@ -837,26 +687,7 @@
           <w:color w:val="1F3864"/>
           <w:sz w:val="22"/>
         </w:rPr>
-        <w:t>3.1  YCIS_CUST_TYPE — Customer classification</w:t>
-      </w:r>
-    </w:p>
-    <w:p>
-      <w:r>
-        <w:rPr>
-          <w:i w:val="0"/>
-          <w:sz w:val="21"/>
-        </w:rPr>
-        <w:t>Determines whether a customer is an Actual User (A) or a Trader / AUT (T). This drives the applicable waiver rule and the 200 MT monthly cap for traders. Maintained when a new customer-attribute value needs mapping.</w:t>
-      </w:r>
-    </w:p>
-    <w:p>
-      <w:r>
-        <w:rPr>
-          <w:b/>
-          <w:color w:val="1F3864"/>
-          <w:sz w:val="22"/>
-        </w:rPr>
-        <w:t>3.2  YCIS_WAIVER_RULE — Waiver eligibility rules</w:t>
+        <w:t>3.1  YCIS_WAIVER_RULE — Waiver eligibility rules</w:t>
       </w:r>
     </w:p>
     <w:p>
@@ -875,7 +706,7 @@
           <w:color w:val="1F3864"/>
           <w:sz w:val="22"/>
         </w:rPr>
-        <w:t>3.3  YCIS_SHORTFALL — Shortfall material declarations</w:t>
+        <w:t>3.2  YCIS_SHORTFALL — Shortfall material declarations</w:t>
       </w:r>
     </w:p>
     <w:p>
@@ -894,7 +725,7 @@
           <w:color w:val="1F3864"/>
           <w:sz w:val="22"/>
         </w:rPr>
-        <w:t>3.4  YCIS_NODISC_GRD — Non-discount grades</w:t>
+        <w:t>3.3  YCIS_NODISC_GRD — Non-discount grades</w:t>
       </w:r>
     </w:p>
     <w:p>
@@ -904,25 +735,6 @@
           <w:sz w:val="21"/>
         </w:rPr>
         <w:t>Lists the grades (PS, GS, Powder, Polyfines) that count towards lifting eligibility but do not attract a discount. Maintained only when the non-discount grade list changes.</w:t>
-      </w:r>
-    </w:p>
-    <w:p>
-      <w:r>
-        <w:rPr>
-          <w:b/>
-          <w:color w:val="1F3864"/>
-          <w:sz w:val="22"/>
-        </w:rPr>
-        <w:t>3.5  YCIS_SCH_PARAM — Scheme parameters</w:t>
-      </w:r>
-    </w:p>
-    <w:p>
-      <w:r>
-        <w:rPr>
-          <w:i w:val="0"/>
-          <w:sz w:val="21"/>
-        </w:rPr>
-        <w:t>Holds general numeric parameters so they are not hard-coded — for example the Trader/AUT monthly cap of 200 MT. Maintained only when a scheme limit changes.</w:t>
       </w:r>
     </w:p>
     <w:p>

</xml_diff>